<commit_message>
DATA PREPROCESSING AND END TO END ML HOUSE PRICE PREDICTION DATASET
</commit_message>
<xml_diff>
--- a/Lab 2.docx
+++ b/Lab 2.docx
@@ -1,6 +1,6 @@
 
 <file path=word/document.xml><?xml version="1.0" encoding="utf-8"?>
-<w:document xmlns:wpc="http://schemas.microsoft.com/office/word/2010/wordprocessingCanvas" xmlns:cx="http://schemas.microsoft.com/office/drawing/2014/chartex" xmlns:cx1="http://schemas.microsoft.com/office/drawing/2015/9/8/chartex" xmlns:cx2="http://schemas.microsoft.com/office/drawing/2015/10/21/chartex" xmlns:cx3="http://schemas.microsoft.com/office/drawing/2016/5/9/chartex" xmlns:cx4="http://schemas.microsoft.com/office/drawing/2016/5/10/chartex" xmlns:cx5="http://schemas.microsoft.com/office/drawing/2016/5/11/chartex" xmlns:cx6="http://schemas.microsoft.com/office/drawing/2016/5/12/chartex" xmlns:cx7="http://schemas.microsoft.com/office/drawing/2016/5/13/chartex" xmlns:cx8="http://schemas.microsoft.com/office/drawing/2016/5/14/chartex" xmlns:mc="http://schemas.openxmlformats.org/markup-compatibility/2006" xmlns:aink="http://schemas.microsoft.com/office/drawing/2016/ink" xmlns:am3d="http://schemas.microsoft.com/office/drawing/2017/model3d" xmlns:o="urn:schemas-microsoft-com:office:office" xmlns:r="http://schemas.openxmlformats.org/officeDocument/2006/relationships" xmlns:m="http://schemas.openxmlformats.org/officeDocument/2006/math" xmlns:v="urn:schemas-microsoft-com:vml" xmlns:wp14="http://schemas.microsoft.com/office/word/2010/wordprocessingDrawing" xmlns:wp="http://schemas.openxmlformats.org/drawingml/2006/wordprocessingDrawing" xmlns:w10="urn:schemas-microsoft-com:office:word" xmlns:w="http://schemas.openxmlformats.org/wordprocessingml/2006/main" xmlns:w14="http://schemas.microsoft.com/office/word/2010/wordml" xmlns:w15="http://schemas.microsoft.com/office/word/2012/wordml" xmlns:w16cex="http://schemas.microsoft.com/office/word/2018/wordml/cex" xmlns:w16cid="http://schemas.microsoft.com/office/word/2016/wordml/cid" xmlns:w16="http://schemas.microsoft.com/office/word/2018/wordml" xmlns:w16sdtdh="http://schemas.microsoft.com/office/word/2020/wordml/sdtdatahash" xmlns:w16se="http://schemas.microsoft.com/office/word/2015/wordml/symex" xmlns:wpg="http://schemas.microsoft.com/office/word/2010/wordprocessingGroup" xmlns:wpi="http://schemas.microsoft.com/office/word/2010/wordprocessingInk" xmlns:wne="http://schemas.microsoft.com/office/word/2006/wordml" xmlns:wps="http://schemas.microsoft.com/office/word/2010/wordprocessingShape" mc:Ignorable="w14 w15 w16se w16cid w16 w16cex w16sdtdh wp14">
+<w:document xmlns:wpc="http://schemas.microsoft.com/office/word/2010/wordprocessingCanvas" xmlns:cx="http://schemas.microsoft.com/office/drawing/2014/chartex" xmlns:cx1="http://schemas.microsoft.com/office/drawing/2015/9/8/chartex" xmlns:cx2="http://schemas.microsoft.com/office/drawing/2015/10/21/chartex" xmlns:cx3="http://schemas.microsoft.com/office/drawing/2016/5/9/chartex" xmlns:cx4="http://schemas.microsoft.com/office/drawing/2016/5/10/chartex" xmlns:cx5="http://schemas.microsoft.com/office/drawing/2016/5/11/chartex" xmlns:cx6="http://schemas.microsoft.com/office/drawing/2016/5/12/chartex" xmlns:cx7="http://schemas.microsoft.com/office/drawing/2016/5/13/chartex" xmlns:cx8="http://schemas.microsoft.com/office/drawing/2016/5/14/chartex" xmlns:mc="http://schemas.openxmlformats.org/markup-compatibility/2006" xmlns:aink="http://schemas.microsoft.com/office/drawing/2016/ink" xmlns:am3d="http://schemas.microsoft.com/office/drawing/2017/model3d" xmlns:o="urn:schemas-microsoft-com:office:office" xmlns:oel="http://schemas.microsoft.com/office/2019/extlst" xmlns:r="http://schemas.openxmlformats.org/officeDocument/2006/relationships" xmlns:m="http://schemas.openxmlformats.org/officeDocument/2006/math" xmlns:v="urn:schemas-microsoft-com:vml" xmlns:wp14="http://schemas.microsoft.com/office/word/2010/wordprocessingDrawing" xmlns:wp="http://schemas.openxmlformats.org/drawingml/2006/wordprocessingDrawing" xmlns:w10="urn:schemas-microsoft-com:office:word" xmlns:w="http://schemas.openxmlformats.org/wordprocessingml/2006/main" xmlns:w14="http://schemas.microsoft.com/office/word/2010/wordml" xmlns:w15="http://schemas.microsoft.com/office/word/2012/wordml" xmlns:w16cex="http://schemas.microsoft.com/office/word/2018/wordml/cex" xmlns:w16cid="http://schemas.microsoft.com/office/word/2016/wordml/cid" xmlns:w16="http://schemas.microsoft.com/office/word/2018/wordml" xmlns:w16du="http://schemas.microsoft.com/office/word/2023/wordml/word16du" xmlns:w16sdtdh="http://schemas.microsoft.com/office/word/2020/wordml/sdtdatahash" xmlns:w16sdtfl="http://schemas.microsoft.com/office/word/2024/wordml/sdtformatlock" xmlns:w16se="http://schemas.microsoft.com/office/word/2015/wordml/symex" xmlns:wpg="http://schemas.microsoft.com/office/word/2010/wordprocessingGroup" xmlns:wpi="http://schemas.microsoft.com/office/word/2010/wordprocessingInk" xmlns:wne="http://schemas.microsoft.com/office/word/2006/wordml" xmlns:wps="http://schemas.microsoft.com/office/word/2010/wordprocessingShape" mc:Ignorable="w14 w15 w16se w16cid w16 w16cex w16sdtdh w16sdtfl w16du wp14">
   <w:body>
     <w:p>
       <w:pPr>
@@ -14,14 +14,963 @@
         </w:rPr>
         <w:t>Lab 2:</w:t>
       </w:r>
-      <w:r>
+    </w:p>
+    <w:p>
+      <w:pPr>
         <w:rPr>
           <w:lang w:val="en-US"/>
         </w:rPr>
+      </w:pPr>
+      <w:r>
+        <w:rPr>
+          <w:lang w:val="en-US"/>
+        </w:rPr>
+        <w:t>DATA PROCESSION AND END TO END ML</w:t>
+      </w:r>
+    </w:p>
+    <w:p>
+      <w:pPr>
+        <w:pStyle w:val="BodyText"/>
+        <w:spacing w:before="276"/>
+        <w:ind w:left="350"/>
+      </w:pPr>
+      <w:r>
+        <w:t>import pandas as pd</w:t>
+      </w:r>
+    </w:p>
+    <w:p>
+      <w:pPr>
+        <w:pStyle w:val="BodyText"/>
+        <w:spacing w:before="276"/>
+        <w:ind w:left="350"/>
+      </w:pPr>
+      <w:r>
+        <w:t xml:space="preserve">import </w:t>
+      </w:r>
+      <w:proofErr w:type="spellStart"/>
+      <w:r>
+        <w:t>numpy</w:t>
+      </w:r>
+      <w:proofErr w:type="spellEnd"/>
+      <w:r>
+        <w:t xml:space="preserve"> as np</w:t>
+      </w:r>
+    </w:p>
+    <w:p>
+      <w:pPr>
+        <w:pStyle w:val="BodyText"/>
+        <w:spacing w:before="276"/>
+        <w:ind w:left="350"/>
+      </w:pPr>
+      <w:r>
+        <w:t xml:space="preserve">from </w:t>
+      </w:r>
+      <w:proofErr w:type="spellStart"/>
+      <w:proofErr w:type="gramStart"/>
+      <w:r>
+        <w:t>sklearn.datasets</w:t>
+      </w:r>
+      <w:proofErr w:type="spellEnd"/>
+      <w:proofErr w:type="gramEnd"/>
+      <w:r>
+        <w:t xml:space="preserve"> import </w:t>
+      </w:r>
+      <w:proofErr w:type="spellStart"/>
+      <w:r>
+        <w:t>fetch_california_housing</w:t>
+      </w:r>
+      <w:proofErr w:type="spellEnd"/>
+    </w:p>
+    <w:p>
+      <w:pPr>
+        <w:pStyle w:val="BodyText"/>
+        <w:spacing w:before="276"/>
+        <w:ind w:left="350"/>
+      </w:pPr>
+      <w:r>
+        <w:t xml:space="preserve">from </w:t>
+      </w:r>
+      <w:proofErr w:type="spellStart"/>
+      <w:proofErr w:type="gramStart"/>
+      <w:r>
+        <w:t>sklearn.preprocessing</w:t>
+      </w:r>
+      <w:proofErr w:type="spellEnd"/>
+      <w:proofErr w:type="gramEnd"/>
+      <w:r>
+        <w:t xml:space="preserve"> import </w:t>
+      </w:r>
+      <w:proofErr w:type="spellStart"/>
+      <w:r>
+        <w:t>StandardScaler</w:t>
+      </w:r>
+      <w:proofErr w:type="spellEnd"/>
+      <w:r>
+        <w:t xml:space="preserve">, </w:t>
+      </w:r>
+      <w:proofErr w:type="spellStart"/>
+      <w:r>
+        <w:t>MinMaxScaler</w:t>
+      </w:r>
+      <w:proofErr w:type="spellEnd"/>
+    </w:p>
+    <w:p>
+      <w:pPr>
+        <w:pStyle w:val="BodyText"/>
+        <w:spacing w:before="276"/>
+        <w:ind w:left="350"/>
+      </w:pPr>
+      <w:r>
+        <w:t xml:space="preserve">from </w:t>
+      </w:r>
+      <w:proofErr w:type="spellStart"/>
+      <w:proofErr w:type="gramStart"/>
+      <w:r>
+        <w:t>sklearn.impute</w:t>
+      </w:r>
+      <w:proofErr w:type="spellEnd"/>
+      <w:proofErr w:type="gramEnd"/>
+      <w:r>
+        <w:t xml:space="preserve"> import </w:t>
+      </w:r>
+      <w:proofErr w:type="spellStart"/>
+      <w:r>
+        <w:t>SimpleImputer</w:t>
+      </w:r>
+      <w:proofErr w:type="spellEnd"/>
+    </w:p>
+    <w:p>
+      <w:pPr>
+        <w:pStyle w:val="BodyText"/>
+        <w:spacing w:before="276"/>
+        <w:ind w:left="350"/>
+      </w:pPr>
+    </w:p>
+    <w:p>
+      <w:pPr>
+        <w:pStyle w:val="BodyText"/>
+        <w:spacing w:before="276"/>
+        <w:ind w:left="350"/>
+      </w:pPr>
+      <w:r>
+        <w:t># ----------- LOAD INBUILT DATASET -----------</w:t>
+      </w:r>
+    </w:p>
+    <w:p>
+      <w:pPr>
+        <w:pStyle w:val="BodyText"/>
+        <w:spacing w:before="276"/>
+        <w:ind w:left="350"/>
+      </w:pPr>
+      <w:r>
+        <w:t xml:space="preserve">housing = </w:t>
+      </w:r>
+      <w:proofErr w:type="spellStart"/>
+      <w:r>
+        <w:t>fetch_california_</w:t>
+      </w:r>
+      <w:proofErr w:type="gramStart"/>
+      <w:r>
+        <w:t>housing</w:t>
+      </w:r>
+      <w:proofErr w:type="spellEnd"/>
+      <w:r>
+        <w:t>(</w:t>
+      </w:r>
+      <w:proofErr w:type="gramEnd"/>
+      <w:r>
+        <w:t>)</w:t>
+      </w:r>
+    </w:p>
+    <w:p>
+      <w:pPr>
+        <w:pStyle w:val="BodyText"/>
+        <w:spacing w:before="276"/>
+        <w:ind w:left="350"/>
+      </w:pPr>
+      <w:proofErr w:type="spellStart"/>
+      <w:r>
+        <w:t>df</w:t>
+      </w:r>
+      <w:proofErr w:type="spellEnd"/>
+      <w:r>
+        <w:t xml:space="preserve"> = </w:t>
+      </w:r>
+      <w:proofErr w:type="spellStart"/>
+      <w:proofErr w:type="gramStart"/>
+      <w:r>
+        <w:t>pd.DataFrame</w:t>
+      </w:r>
+      <w:proofErr w:type="spellEnd"/>
+      <w:proofErr w:type="gramEnd"/>
+      <w:r>
+        <w:t>(</w:t>
+      </w:r>
+      <w:proofErr w:type="spellStart"/>
+      <w:r>
+        <w:t>housing.data</w:t>
+      </w:r>
+      <w:proofErr w:type="spellEnd"/>
+      <w:r>
+        <w:t>, columns=</w:t>
+      </w:r>
+      <w:proofErr w:type="spellStart"/>
+      <w:proofErr w:type="gramStart"/>
+      <w:r>
+        <w:t>housing.feature</w:t>
+      </w:r>
+      <w:proofErr w:type="gramEnd"/>
+      <w:r>
+        <w:t>_names</w:t>
+      </w:r>
+      <w:proofErr w:type="spellEnd"/>
+      <w:r>
+        <w:t>)</w:t>
+      </w:r>
+    </w:p>
+    <w:p>
+      <w:pPr>
+        <w:pStyle w:val="BodyText"/>
+        <w:spacing w:before="276"/>
+        <w:ind w:left="350"/>
+      </w:pPr>
+      <w:proofErr w:type="spellStart"/>
+      <w:r>
+        <w:t>df</w:t>
+      </w:r>
+      <w:proofErr w:type="spellEnd"/>
+      <w:r>
+        <w:t xml:space="preserve">['Price'] = </w:t>
+      </w:r>
+      <w:proofErr w:type="spellStart"/>
+      <w:proofErr w:type="gramStart"/>
+      <w:r>
+        <w:t>housing.target</w:t>
+      </w:r>
+      <w:proofErr w:type="spellEnd"/>
+      <w:proofErr w:type="gramEnd"/>
+    </w:p>
+    <w:p>
+      <w:pPr>
+        <w:pStyle w:val="BodyText"/>
+        <w:spacing w:before="276"/>
+        <w:ind w:left="350"/>
+      </w:pPr>
+    </w:p>
+    <w:p>
+      <w:pPr>
+        <w:pStyle w:val="BodyText"/>
+        <w:spacing w:before="276"/>
+        <w:ind w:left="350"/>
+      </w:pPr>
+      <w:proofErr w:type="gramStart"/>
+      <w:r>
+        <w:t>print(</w:t>
+      </w:r>
+      <w:proofErr w:type="gramEnd"/>
+      <w:r>
+        <w:t xml:space="preserve">"Original Data:\n", </w:t>
+      </w:r>
+      <w:proofErr w:type="spellStart"/>
+      <w:proofErr w:type="gramStart"/>
+      <w:r>
+        <w:t>df.head</w:t>
+      </w:r>
+      <w:proofErr w:type="spellEnd"/>
+      <w:proofErr w:type="gramEnd"/>
+      <w:r>
+        <w:t>())</w:t>
+      </w:r>
+    </w:p>
+    <w:p>
+      <w:pPr>
+        <w:pStyle w:val="BodyText"/>
+        <w:spacing w:before="276"/>
+        <w:ind w:left="350"/>
+      </w:pPr>
+    </w:p>
+    <w:p>
+      <w:pPr>
+        <w:pStyle w:val="BodyText"/>
+        <w:spacing w:before="276"/>
+        <w:ind w:left="350"/>
+      </w:pPr>
+    </w:p>
+    <w:p>
+      <w:pPr>
+        <w:pStyle w:val="BodyText"/>
+        <w:spacing w:before="276"/>
+        <w:ind w:left="350"/>
+      </w:pPr>
+      <w:r>
+        <w:t># ----------- HANDLING MISSING VALUES -----------</w:t>
+      </w:r>
+    </w:p>
+    <w:p>
+      <w:pPr>
+        <w:pStyle w:val="BodyText"/>
+        <w:spacing w:before="276"/>
+        <w:ind w:left="350"/>
+      </w:pPr>
+      <w:r>
+        <w:t># Introduce some missing values artificially</w:t>
+      </w:r>
+    </w:p>
+    <w:p>
+      <w:pPr>
+        <w:pStyle w:val="BodyText"/>
+        <w:spacing w:before="276"/>
+        <w:ind w:left="350"/>
+      </w:pPr>
+      <w:proofErr w:type="spellStart"/>
+      <w:proofErr w:type="gramStart"/>
+      <w:r>
+        <w:t>df.iloc</w:t>
+      </w:r>
+      <w:proofErr w:type="spellEnd"/>
+      <w:proofErr w:type="gramEnd"/>
+      <w:r>
+        <w:t xml:space="preserve">[0:5, 0] = </w:t>
+      </w:r>
+      <w:proofErr w:type="spellStart"/>
+      <w:r>
+        <w:t>np.nan</w:t>
+      </w:r>
+      <w:proofErr w:type="spellEnd"/>
+    </w:p>
+    <w:p>
+      <w:pPr>
+        <w:pStyle w:val="BodyText"/>
+        <w:spacing w:before="276"/>
+        <w:ind w:left="350"/>
+      </w:pPr>
+    </w:p>
+    <w:p>
+      <w:pPr>
+        <w:pStyle w:val="BodyText"/>
+        <w:spacing w:before="276"/>
+        <w:ind w:left="350"/>
+      </w:pPr>
+      <w:r>
+        <w:t xml:space="preserve">imputer = </w:t>
+      </w:r>
+      <w:proofErr w:type="spellStart"/>
+      <w:r>
+        <w:t>SimpleImputer</w:t>
+      </w:r>
+      <w:proofErr w:type="spellEnd"/>
+      <w:r>
+        <w:t>(strategy='mean')</w:t>
+      </w:r>
+    </w:p>
+    <w:p>
+      <w:pPr>
+        <w:pStyle w:val="BodyText"/>
+        <w:spacing w:before="276"/>
+        <w:ind w:left="350"/>
+      </w:pPr>
+      <w:proofErr w:type="spellStart"/>
+      <w:r>
+        <w:t>df_imputed</w:t>
+      </w:r>
+      <w:proofErr w:type="spellEnd"/>
+      <w:r>
+        <w:t xml:space="preserve"> = </w:t>
+      </w:r>
+      <w:proofErr w:type="spellStart"/>
+      <w:proofErr w:type="gramStart"/>
+      <w:r>
+        <w:t>pd.DataFrame</w:t>
+      </w:r>
+      <w:proofErr w:type="spellEnd"/>
+      <w:proofErr w:type="gramEnd"/>
+      <w:r>
+        <w:t>(</w:t>
+      </w:r>
+      <w:proofErr w:type="spellStart"/>
+      <w:r>
+        <w:t>imputer.fit_transform</w:t>
+      </w:r>
+      <w:proofErr w:type="spellEnd"/>
+      <w:r>
+        <w:t>(</w:t>
+      </w:r>
+      <w:proofErr w:type="spellStart"/>
+      <w:r>
+        <w:t>df</w:t>
+      </w:r>
+      <w:proofErr w:type="spellEnd"/>
+      <w:r>
+        <w:t>), columns=</w:t>
+      </w:r>
+      <w:proofErr w:type="spellStart"/>
+      <w:proofErr w:type="gramStart"/>
+      <w:r>
+        <w:t>df.columns</w:t>
+      </w:r>
+      <w:proofErr w:type="spellEnd"/>
+      <w:proofErr w:type="gramEnd"/>
+      <w:r>
+        <w:t>)</w:t>
+      </w:r>
+    </w:p>
+    <w:p>
+      <w:pPr>
+        <w:pStyle w:val="BodyText"/>
+        <w:spacing w:before="276"/>
+        <w:ind w:left="350"/>
+      </w:pPr>
+    </w:p>
+    <w:p>
+      <w:pPr>
+        <w:pStyle w:val="BodyText"/>
+        <w:spacing w:before="276"/>
+        <w:ind w:left="350"/>
+      </w:pPr>
+      <w:proofErr w:type="gramStart"/>
+      <w:r>
+        <w:t>print(</w:t>
+      </w:r>
+      <w:proofErr w:type="gramEnd"/>
+      <w:r>
+        <w:t>"\</w:t>
+      </w:r>
+      <w:proofErr w:type="spellStart"/>
+      <w:r>
+        <w:t>nAfter</w:t>
+      </w:r>
+      <w:proofErr w:type="spellEnd"/>
+      <w:r>
+        <w:t xml:space="preserve"> Handling Missing Values:\n", </w:t>
+      </w:r>
+      <w:proofErr w:type="spellStart"/>
+      <w:r>
+        <w:t>df_</w:t>
+      </w:r>
+      <w:proofErr w:type="gramStart"/>
+      <w:r>
+        <w:t>imputed.head</w:t>
+      </w:r>
+      <w:proofErr w:type="spellEnd"/>
+      <w:proofErr w:type="gramEnd"/>
+      <w:r>
+        <w:t>())</w:t>
+      </w:r>
+    </w:p>
+    <w:p>
+      <w:pPr>
+        <w:pStyle w:val="BodyText"/>
+        <w:spacing w:before="276"/>
+        <w:ind w:left="350"/>
+      </w:pPr>
+    </w:p>
+    <w:p>
+      <w:pPr>
+        <w:pStyle w:val="BodyText"/>
+        <w:spacing w:before="276"/>
+        <w:ind w:left="350"/>
+      </w:pPr>
+    </w:p>
+    <w:p>
+      <w:pPr>
+        <w:pStyle w:val="BodyText"/>
+        <w:spacing w:before="276"/>
+        <w:ind w:left="350"/>
+      </w:pPr>
+      <w:r>
+        <w:t># ----------- FEATURE SCALING -----------</w:t>
+      </w:r>
+    </w:p>
+    <w:p>
+      <w:pPr>
+        <w:pStyle w:val="BodyText"/>
+        <w:spacing w:before="276"/>
+        <w:ind w:left="350"/>
+      </w:pPr>
+      <w:r>
+        <w:t># Standardization</w:t>
+      </w:r>
+    </w:p>
+    <w:p>
+      <w:pPr>
+        <w:pStyle w:val="BodyText"/>
+        <w:spacing w:before="276"/>
+        <w:ind w:left="350"/>
+      </w:pPr>
+      <w:r>
+        <w:t xml:space="preserve">scaler = </w:t>
+      </w:r>
+      <w:proofErr w:type="spellStart"/>
+      <w:proofErr w:type="gramStart"/>
+      <w:r>
+        <w:t>StandardScaler</w:t>
+      </w:r>
+      <w:proofErr w:type="spellEnd"/>
+      <w:r>
+        <w:t>(</w:t>
+      </w:r>
+      <w:proofErr w:type="gramEnd"/>
+      <w:r>
+        <w:t>)</w:t>
+      </w:r>
+    </w:p>
+    <w:p>
+      <w:pPr>
+        <w:pStyle w:val="BodyText"/>
+        <w:spacing w:before="276"/>
+        <w:ind w:left="350"/>
+      </w:pPr>
+      <w:proofErr w:type="spellStart"/>
+      <w:r>
+        <w:t>df_scaled</w:t>
+      </w:r>
+      <w:proofErr w:type="spellEnd"/>
+      <w:r>
+        <w:t xml:space="preserve"> = </w:t>
+      </w:r>
+      <w:proofErr w:type="spellStart"/>
+      <w:proofErr w:type="gramStart"/>
+      <w:r>
+        <w:t>pd.DataFrame</w:t>
+      </w:r>
+      <w:proofErr w:type="spellEnd"/>
+      <w:proofErr w:type="gramEnd"/>
+      <w:r>
+        <w:t>(</w:t>
+      </w:r>
+      <w:proofErr w:type="spellStart"/>
+      <w:r>
+        <w:t>scaler.fit_transform</w:t>
+      </w:r>
+      <w:proofErr w:type="spellEnd"/>
+      <w:r>
+        <w:t>(</w:t>
+      </w:r>
+      <w:proofErr w:type="spellStart"/>
+      <w:r>
+        <w:t>df_imputed</w:t>
+      </w:r>
+      <w:proofErr w:type="spellEnd"/>
+      <w:r>
+        <w:t>), columns=</w:t>
+      </w:r>
+      <w:proofErr w:type="spellStart"/>
+      <w:proofErr w:type="gramStart"/>
+      <w:r>
+        <w:t>df.columns</w:t>
+      </w:r>
+      <w:proofErr w:type="spellEnd"/>
+      <w:proofErr w:type="gramEnd"/>
+      <w:r>
+        <w:t>)</w:t>
+      </w:r>
+    </w:p>
+    <w:p>
+      <w:pPr>
+        <w:pStyle w:val="BodyText"/>
+        <w:spacing w:before="276"/>
+        <w:ind w:left="350"/>
+      </w:pPr>
+    </w:p>
+    <w:p>
+      <w:pPr>
+        <w:pStyle w:val="BodyText"/>
+        <w:spacing w:before="276"/>
+        <w:ind w:left="350"/>
+      </w:pPr>
+      <w:proofErr w:type="gramStart"/>
+      <w:r>
+        <w:t>print(</w:t>
+      </w:r>
+      <w:proofErr w:type="gramEnd"/>
+      <w:r>
+        <w:t>"\</w:t>
+      </w:r>
+      <w:proofErr w:type="spellStart"/>
+      <w:r>
+        <w:t>nAfter</w:t>
+      </w:r>
+      <w:proofErr w:type="spellEnd"/>
+      <w:r>
+        <w:t xml:space="preserve"> Standardization:\n", </w:t>
+      </w:r>
+      <w:proofErr w:type="spellStart"/>
+      <w:r>
+        <w:t>df_</w:t>
+      </w:r>
+      <w:proofErr w:type="gramStart"/>
+      <w:r>
+        <w:t>scaled.head</w:t>
+      </w:r>
+      <w:proofErr w:type="spellEnd"/>
+      <w:proofErr w:type="gramEnd"/>
+      <w:r>
+        <w:t>())</w:t>
+      </w:r>
+    </w:p>
+    <w:p>
+      <w:pPr>
+        <w:pStyle w:val="BodyText"/>
+        <w:spacing w:before="276"/>
+        <w:ind w:left="350"/>
+      </w:pPr>
+    </w:p>
+    <w:p>
+      <w:pPr>
+        <w:pStyle w:val="BodyText"/>
+        <w:spacing w:before="276"/>
+        <w:ind w:left="350"/>
+      </w:pPr>
+    </w:p>
+    <w:p>
+      <w:pPr>
+        <w:pStyle w:val="BodyText"/>
+        <w:spacing w:before="276"/>
+        <w:ind w:left="350"/>
+      </w:pPr>
+      <w:r>
+        <w:t># ----------- NORMALIZATION -----------</w:t>
+      </w:r>
+    </w:p>
+    <w:p>
+      <w:pPr>
+        <w:pStyle w:val="BodyText"/>
+        <w:spacing w:before="276"/>
+        <w:ind w:left="350"/>
+      </w:pPr>
+      <w:r>
+        <w:t xml:space="preserve">minmax = </w:t>
+      </w:r>
+      <w:proofErr w:type="spellStart"/>
+      <w:proofErr w:type="gramStart"/>
+      <w:r>
+        <w:t>MinMaxScaler</w:t>
+      </w:r>
+      <w:proofErr w:type="spellEnd"/>
+      <w:r>
+        <w:t>(</w:t>
+      </w:r>
+      <w:proofErr w:type="gramEnd"/>
+      <w:r>
+        <w:t>)</w:t>
+      </w:r>
+    </w:p>
+    <w:p>
+      <w:pPr>
+        <w:pStyle w:val="BodyText"/>
+        <w:spacing w:before="276"/>
+        <w:ind w:left="350"/>
+      </w:pPr>
+      <w:proofErr w:type="spellStart"/>
+      <w:r>
+        <w:t>df_normalized</w:t>
+      </w:r>
+      <w:proofErr w:type="spellEnd"/>
+      <w:r>
+        <w:t xml:space="preserve"> = </w:t>
+      </w:r>
+      <w:proofErr w:type="spellStart"/>
+      <w:proofErr w:type="gramStart"/>
+      <w:r>
+        <w:t>pd.DataFrame</w:t>
+      </w:r>
+      <w:proofErr w:type="spellEnd"/>
+      <w:proofErr w:type="gramEnd"/>
+      <w:r>
+        <w:t>(</w:t>
+      </w:r>
+      <w:proofErr w:type="spellStart"/>
+      <w:r>
+        <w:t>minmax.fit_transform</w:t>
+      </w:r>
+      <w:proofErr w:type="spellEnd"/>
+      <w:r>
+        <w:t>(</w:t>
+      </w:r>
+      <w:proofErr w:type="spellStart"/>
+      <w:r>
+        <w:t>df_imputed</w:t>
+      </w:r>
+      <w:proofErr w:type="spellEnd"/>
+      <w:r>
+        <w:t>), columns=</w:t>
+      </w:r>
+      <w:proofErr w:type="spellStart"/>
+      <w:proofErr w:type="gramStart"/>
+      <w:r>
+        <w:t>df.columns</w:t>
+      </w:r>
+      <w:proofErr w:type="spellEnd"/>
+      <w:proofErr w:type="gramEnd"/>
+      <w:r>
+        <w:t>)</w:t>
+      </w:r>
+    </w:p>
+    <w:p>
+      <w:pPr>
+        <w:pStyle w:val="BodyText"/>
+        <w:spacing w:before="276"/>
+        <w:ind w:left="350"/>
+      </w:pPr>
+    </w:p>
+    <w:p>
+      <w:pPr>
+        <w:pStyle w:val="BodyText"/>
+        <w:spacing w:before="276"/>
+        <w:ind w:left="350"/>
+      </w:pPr>
+      <w:proofErr w:type="gramStart"/>
+      <w:r>
+        <w:t>print(</w:t>
+      </w:r>
+      <w:proofErr w:type="gramEnd"/>
+      <w:r>
+        <w:t>"\</w:t>
+      </w:r>
+      <w:proofErr w:type="spellStart"/>
+      <w:r>
+        <w:t>nAfter</w:t>
+      </w:r>
+      <w:proofErr w:type="spellEnd"/>
+      <w:r>
+        <w:t xml:space="preserve"> Normalization:\n", </w:t>
+      </w:r>
+      <w:proofErr w:type="spellStart"/>
+      <w:r>
+        <w:t>df_</w:t>
+      </w:r>
+      <w:proofErr w:type="gramStart"/>
+      <w:r>
+        <w:t>normalized.head</w:t>
+      </w:r>
+      <w:proofErr w:type="spellEnd"/>
+      <w:proofErr w:type="gramEnd"/>
+      <w:r>
+        <w:t>())</w:t>
+      </w:r>
+    </w:p>
+    <w:p>
+      <w:pPr>
+        <w:pStyle w:val="BodyText"/>
+        <w:spacing w:before="276"/>
+        <w:ind w:left="350"/>
+      </w:pPr>
+    </w:p>
+    <w:p>
+      <w:pPr>
+        <w:pStyle w:val="BodyText"/>
+        <w:spacing w:before="276"/>
+        <w:ind w:left="350"/>
+      </w:pPr>
+    </w:p>
+    <w:p>
+      <w:pPr>
+        <w:pStyle w:val="BodyText"/>
+        <w:spacing w:before="276"/>
+        <w:ind w:left="350"/>
+      </w:pPr>
+      <w:r>
+        <w:t># ----------- FEATURE SELECTION -----------</w:t>
+      </w:r>
+    </w:p>
+    <w:p>
+      <w:pPr>
+        <w:pStyle w:val="BodyText"/>
+        <w:spacing w:before="276"/>
+        <w:ind w:left="350"/>
+      </w:pPr>
+      <w:r>
+        <w:t># Selecting important features (example)</w:t>
+      </w:r>
+    </w:p>
+    <w:p>
+      <w:pPr>
+        <w:pStyle w:val="BodyText"/>
+        <w:spacing w:before="276"/>
+        <w:ind w:left="350"/>
+      </w:pPr>
+      <w:proofErr w:type="spellStart"/>
+      <w:r>
+        <w:t>selected_features</w:t>
+      </w:r>
+      <w:proofErr w:type="spellEnd"/>
+      <w:r>
+        <w:t xml:space="preserve"> = </w:t>
+      </w:r>
+      <w:proofErr w:type="spellStart"/>
+      <w:proofErr w:type="gramStart"/>
+      <w:r>
+        <w:t>df</w:t>
+      </w:r>
+      <w:proofErr w:type="spellEnd"/>
+      <w:r>
+        <w:t>[</w:t>
+      </w:r>
+      <w:proofErr w:type="gramEnd"/>
+      <w:r>
+        <w:t>['</w:t>
+      </w:r>
+      <w:proofErr w:type="spellStart"/>
+      <w:r>
+        <w:t>MedInc</w:t>
+      </w:r>
+      <w:proofErr w:type="spellEnd"/>
+      <w:r>
+        <w:t>', '</w:t>
+      </w:r>
+      <w:proofErr w:type="spellStart"/>
+      <w:r>
+        <w:t>HouseAge</w:t>
+      </w:r>
+      <w:proofErr w:type="spellEnd"/>
+      <w:r>
+        <w:t>', '</w:t>
+      </w:r>
+      <w:proofErr w:type="spellStart"/>
+      <w:r>
+        <w:t>AveRooms</w:t>
+      </w:r>
+      <w:proofErr w:type="spellEnd"/>
+      <w:r>
+        <w:t>', 'Price']]</w:t>
+      </w:r>
+    </w:p>
+    <w:p>
+      <w:pPr>
+        <w:pStyle w:val="BodyText"/>
+        <w:spacing w:before="276"/>
+        <w:ind w:left="350"/>
+      </w:pPr>
+      <w:proofErr w:type="gramStart"/>
+      <w:r>
+        <w:t>print(</w:t>
+      </w:r>
+      <w:proofErr w:type="gramEnd"/>
+      <w:r>
+        <w:t>"\</w:t>
+      </w:r>
+      <w:proofErr w:type="spellStart"/>
+      <w:r>
+        <w:t>nSelected</w:t>
+      </w:r>
+      <w:proofErr w:type="spellEnd"/>
+      <w:r>
+        <w:t xml:space="preserve"> Features:\n", </w:t>
+      </w:r>
+      <w:proofErr w:type="spellStart"/>
+      <w:r>
+        <w:t>selected_</w:t>
+      </w:r>
+      <w:proofErr w:type="gramStart"/>
+      <w:r>
+        <w:t>features.head</w:t>
+      </w:r>
+      <w:proofErr w:type="spellEnd"/>
+      <w:proofErr w:type="gramEnd"/>
+      <w:r>
+        <w:t>())</w:t>
+      </w:r>
+    </w:p>
+    <w:p>
+      <w:pPr>
+        <w:pStyle w:val="BodyText"/>
+        <w:spacing w:before="276"/>
+        <w:ind w:left="350"/>
+      </w:pPr>
+    </w:p>
+    <w:p>
+      <w:pPr>
+        <w:pStyle w:val="BodyText"/>
+        <w:spacing w:before="276"/>
+        <w:ind w:left="350"/>
+      </w:pPr>
+    </w:p>
+    <w:p>
+      <w:pPr>
+        <w:pStyle w:val="BodyText"/>
+        <w:spacing w:before="276"/>
+        <w:ind w:left="350"/>
+      </w:pPr>
+      <w:r>
+        <w:t># ----------- EXPORT CLEANED DATA -----------</w:t>
+      </w:r>
+    </w:p>
+    <w:p>
+      <w:pPr>
+        <w:pStyle w:val="BodyText"/>
+        <w:spacing w:before="276"/>
+        <w:ind w:left="350"/>
+      </w:pPr>
+      <w:proofErr w:type="spellStart"/>
+      <w:r>
+        <w:t>df_imputed.to_</w:t>
+      </w:r>
+      <w:proofErr w:type="gramStart"/>
+      <w:r>
+        <w:t>csv</w:t>
+      </w:r>
+      <w:proofErr w:type="spellEnd"/>
+      <w:r>
+        <w:t>(</w:t>
+      </w:r>
+      <w:proofErr w:type="gramEnd"/>
+      <w:r>
+        <w:t>"cleaned_housing.csv", index=False)</w:t>
+      </w:r>
+    </w:p>
+    <w:p>
+      <w:pPr>
+        <w:pStyle w:val="BodyText"/>
+        <w:spacing w:before="276"/>
+        <w:ind w:left="350"/>
+      </w:pPr>
+    </w:p>
+    <w:p>
+      <w:pPr>
+        <w:pStyle w:val="BodyText"/>
+        <w:spacing w:before="276"/>
+        <w:ind w:left="350"/>
+      </w:pPr>
+      <w:proofErr w:type="gramStart"/>
+      <w:r>
+        <w:lastRenderedPageBreak/>
+        <w:t>print(</w:t>
+      </w:r>
+      <w:proofErr w:type="gramEnd"/>
+      <w:r>
+        <w:t>"\</w:t>
+      </w:r>
+      <w:proofErr w:type="spellStart"/>
+      <w:r>
+        <w:t>nPreprocessed</w:t>
+      </w:r>
+      <w:proofErr w:type="spellEnd"/>
+      <w:r>
+        <w:t xml:space="preserve"> data exported successfully!")</w:t>
+      </w:r>
+    </w:p>
+    <w:p>
+      <w:pPr>
+        <w:pStyle w:val="BodyText"/>
+        <w:spacing w:before="276"/>
+        <w:ind w:left="350"/>
+      </w:pPr>
+    </w:p>
+    <w:p>
+      <w:pPr>
+        <w:rPr>
+          <w:lang w:val="en-US"/>
+        </w:rPr>
+      </w:pPr>
+      <w:r>
+        <w:rPr>
+          <w:lang w:val="en-US"/>
+        </w:rPr>
         <w:br/>
       </w:r>
       <w:r>
         <w:rPr>
+          <w:noProof/>
           <w:lang w:val="en-US"/>
         </w:rPr>
         <w:drawing>
@@ -69,8 +1018,10 @@
       </w:pPr>
       <w:r>
         <w:rPr>
+          <w:noProof/>
           <w:lang w:val="en-US"/>
         </w:rPr>
+        <w:lastRenderedPageBreak/>
         <w:drawing>
           <wp:inline distT="0" distB="0" distL="0" distR="0" wp14:anchorId="0FB11F4E" wp14:editId="190AA371">
             <wp:extent cx="5572903" cy="3010320"/>
@@ -116,9 +1067,9 @@
       </w:pPr>
       <w:r>
         <w:rPr>
+          <w:noProof/>
           <w:lang w:val="en-US"/>
         </w:rPr>
-        <w:lastRenderedPageBreak/>
         <w:drawing>
           <wp:inline distT="0" distB="0" distL="0" distR="0" wp14:anchorId="4B340448" wp14:editId="60F9C4B9">
             <wp:extent cx="5731510" cy="4375785"/>
@@ -164,8 +1115,10 @@
       </w:pPr>
       <w:r>
         <w:rPr>
+          <w:noProof/>
           <w:lang w:val="en-US"/>
         </w:rPr>
+        <w:lastRenderedPageBreak/>
         <w:drawing>
           <wp:inline distT="0" distB="0" distL="0" distR="0" wp14:anchorId="2F343329" wp14:editId="1F050362">
             <wp:extent cx="5731510" cy="3695700"/>
@@ -225,6 +1178,7 @@
       </w:pPr>
       <w:r>
         <w:rPr>
+          <w:noProof/>
           <w:lang w:val="en-US"/>
         </w:rPr>
         <w:lastRenderedPageBreak/>
@@ -266,6 +1220,7 @@
       </w:r>
       <w:r>
         <w:rPr>
+          <w:noProof/>
           <w:lang w:val="en-US"/>
         </w:rPr>
         <w:drawing>
@@ -341,6 +1296,7 @@
       </w:pPr>
       <w:r>
         <w:rPr>
+          <w:noProof/>
           <w:lang w:val="en-US"/>
         </w:rPr>
         <w:lastRenderedPageBreak/>
@@ -389,6 +1345,7 @@
       </w:pPr>
       <w:r>
         <w:rPr>
+          <w:noProof/>
           <w:lang w:val="en-US"/>
         </w:rPr>
         <w:drawing>
@@ -443,6 +1400,7 @@
       </w:pPr>
       <w:r>
         <w:rPr>
+          <w:noProof/>
           <w:lang w:val="en-US"/>
         </w:rPr>
         <w:lastRenderedPageBreak/>
@@ -1984,7 +2942,7 @@
 </file>
 
 <file path=word/numbering.xml><?xml version="1.0" encoding="utf-8"?>
-<w:numbering xmlns:wpc="http://schemas.microsoft.com/office/word/2010/wordprocessingCanvas" xmlns:cx="http://schemas.microsoft.com/office/drawing/2014/chartex" xmlns:cx1="http://schemas.microsoft.com/office/drawing/2015/9/8/chartex" xmlns:cx2="http://schemas.microsoft.com/office/drawing/2015/10/21/chartex" xmlns:cx3="http://schemas.microsoft.com/office/drawing/2016/5/9/chartex" xmlns:cx4="http://schemas.microsoft.com/office/drawing/2016/5/10/chartex" xmlns:cx5="http://schemas.microsoft.com/office/drawing/2016/5/11/chartex" xmlns:cx6="http://schemas.microsoft.com/office/drawing/2016/5/12/chartex" xmlns:cx7="http://schemas.microsoft.com/office/drawing/2016/5/13/chartex" xmlns:cx8="http://schemas.microsoft.com/office/drawing/2016/5/14/chartex" xmlns:mc="http://schemas.openxmlformats.org/markup-compatibility/2006" xmlns:aink="http://schemas.microsoft.com/office/drawing/2016/ink" xmlns:am3d="http://schemas.microsoft.com/office/drawing/2017/model3d" xmlns:o="urn:schemas-microsoft-com:office:office" xmlns:r="http://schemas.openxmlformats.org/officeDocument/2006/relationships" xmlns:m="http://schemas.openxmlformats.org/officeDocument/2006/math" xmlns:v="urn:schemas-microsoft-com:vml" xmlns:wp14="http://schemas.microsoft.com/office/word/2010/wordprocessingDrawing" xmlns:wp="http://schemas.openxmlformats.org/drawingml/2006/wordprocessingDrawing" xmlns:w10="urn:schemas-microsoft-com:office:word" xmlns:w="http://schemas.openxmlformats.org/wordprocessingml/2006/main" xmlns:w14="http://schemas.microsoft.com/office/word/2010/wordml" xmlns:w15="http://schemas.microsoft.com/office/word/2012/wordml" xmlns:w16cex="http://schemas.microsoft.com/office/word/2018/wordml/cex" xmlns:w16cid="http://schemas.microsoft.com/office/word/2016/wordml/cid" xmlns:w16="http://schemas.microsoft.com/office/word/2018/wordml" xmlns:w16sdtdh="http://schemas.microsoft.com/office/word/2020/wordml/sdtdatahash" xmlns:w16se="http://schemas.microsoft.com/office/word/2015/wordml/symex" xmlns:wpg="http://schemas.microsoft.com/office/word/2010/wordprocessingGroup" xmlns:wpi="http://schemas.microsoft.com/office/word/2010/wordprocessingInk" xmlns:wne="http://schemas.microsoft.com/office/word/2006/wordml" xmlns:wps="http://schemas.microsoft.com/office/word/2010/wordprocessingShape" mc:Ignorable="w14 w15 w16se w16cid w16 w16cex w16sdtdh wp14">
+<w:numbering xmlns:wpc="http://schemas.microsoft.com/office/word/2010/wordprocessingCanvas" xmlns:cx="http://schemas.microsoft.com/office/drawing/2014/chartex" xmlns:cx1="http://schemas.microsoft.com/office/drawing/2015/9/8/chartex" xmlns:cx2="http://schemas.microsoft.com/office/drawing/2015/10/21/chartex" xmlns:cx3="http://schemas.microsoft.com/office/drawing/2016/5/9/chartex" xmlns:cx4="http://schemas.microsoft.com/office/drawing/2016/5/10/chartex" xmlns:cx5="http://schemas.microsoft.com/office/drawing/2016/5/11/chartex" xmlns:cx6="http://schemas.microsoft.com/office/drawing/2016/5/12/chartex" xmlns:cx7="http://schemas.microsoft.com/office/drawing/2016/5/13/chartex" xmlns:cx8="http://schemas.microsoft.com/office/drawing/2016/5/14/chartex" xmlns:mc="http://schemas.openxmlformats.org/markup-compatibility/2006" xmlns:aink="http://schemas.microsoft.com/office/drawing/2016/ink" xmlns:am3d="http://schemas.microsoft.com/office/drawing/2017/model3d" xmlns:o="urn:schemas-microsoft-com:office:office" xmlns:oel="http://schemas.microsoft.com/office/2019/extlst" xmlns:r="http://schemas.openxmlformats.org/officeDocument/2006/relationships" xmlns:m="http://schemas.openxmlformats.org/officeDocument/2006/math" xmlns:v="urn:schemas-microsoft-com:vml" xmlns:wp14="http://schemas.microsoft.com/office/word/2010/wordprocessingDrawing" xmlns:wp="http://schemas.openxmlformats.org/drawingml/2006/wordprocessingDrawing" xmlns:w10="urn:schemas-microsoft-com:office:word" xmlns:w="http://schemas.openxmlformats.org/wordprocessingml/2006/main" xmlns:w14="http://schemas.microsoft.com/office/word/2010/wordml" xmlns:w15="http://schemas.microsoft.com/office/word/2012/wordml" xmlns:w16cex="http://schemas.microsoft.com/office/word/2018/wordml/cex" xmlns:w16cid="http://schemas.microsoft.com/office/word/2016/wordml/cid" xmlns:w16="http://schemas.microsoft.com/office/word/2018/wordml" xmlns:w16du="http://schemas.microsoft.com/office/word/2023/wordml/word16du" xmlns:w16sdtdh="http://schemas.microsoft.com/office/word/2020/wordml/sdtdatahash" xmlns:w16sdtfl="http://schemas.microsoft.com/office/word/2024/wordml/sdtformatlock" xmlns:w16se="http://schemas.microsoft.com/office/word/2015/wordml/symex" xmlns:wpg="http://schemas.microsoft.com/office/word/2010/wordprocessingGroup" xmlns:wpi="http://schemas.microsoft.com/office/word/2010/wordprocessingInk" xmlns:wne="http://schemas.microsoft.com/office/word/2006/wordml" xmlns:wps="http://schemas.microsoft.com/office/word/2010/wordprocessingShape" mc:Ignorable="w14 w15 w16se w16cid w16 w16cex w16sdtdh w16sdtfl w16du wp14">
   <w:abstractNum w:abstractNumId="0" w15:restartNumberingAfterBreak="0">
     <w:nsid w:val="23231C44"/>
     <w:multiLevelType w:val="multilevel"/>
@@ -2581,23 +3539,23 @@
       </w:rPr>
     </w:lvl>
   </w:abstractNum>
-  <w:num w:numId="1">
+  <w:num w:numId="1" w16cid:durableId="813257436">
     <w:abstractNumId w:val="0"/>
   </w:num>
-  <w:num w:numId="2">
+  <w:num w:numId="2" w16cid:durableId="479425985">
     <w:abstractNumId w:val="1"/>
   </w:num>
-  <w:num w:numId="3">
+  <w:num w:numId="3" w16cid:durableId="1855797783">
     <w:abstractNumId w:val="3"/>
   </w:num>
-  <w:num w:numId="4">
+  <w:num w:numId="4" w16cid:durableId="973490858">
     <w:abstractNumId w:val="2"/>
   </w:num>
 </w:numbering>
 </file>
 
 <file path=word/styles.xml><?xml version="1.0" encoding="utf-8"?>
-<w:styles xmlns:mc="http://schemas.openxmlformats.org/markup-compatibility/2006" xmlns:r="http://schemas.openxmlformats.org/officeDocument/2006/relationships" xmlns:w="http://schemas.openxmlformats.org/wordprocessingml/2006/main" xmlns:w14="http://schemas.microsoft.com/office/word/2010/wordml" xmlns:w15="http://schemas.microsoft.com/office/word/2012/wordml" xmlns:w16cex="http://schemas.microsoft.com/office/word/2018/wordml/cex" xmlns:w16cid="http://schemas.microsoft.com/office/word/2016/wordml/cid" xmlns:w16="http://schemas.microsoft.com/office/word/2018/wordml" xmlns:w16sdtdh="http://schemas.microsoft.com/office/word/2020/wordml/sdtdatahash" xmlns:w16se="http://schemas.microsoft.com/office/word/2015/wordml/symex" mc:Ignorable="w14 w15 w16se w16cid w16 w16cex w16sdtdh">
+<w:styles xmlns:mc="http://schemas.openxmlformats.org/markup-compatibility/2006" xmlns:r="http://schemas.openxmlformats.org/officeDocument/2006/relationships" xmlns:w="http://schemas.openxmlformats.org/wordprocessingml/2006/main" xmlns:w14="http://schemas.microsoft.com/office/word/2010/wordml" xmlns:w15="http://schemas.microsoft.com/office/word/2012/wordml" xmlns:w16cex="http://schemas.microsoft.com/office/word/2018/wordml/cex" xmlns:w16cid="http://schemas.microsoft.com/office/word/2016/wordml/cid" xmlns:w16="http://schemas.microsoft.com/office/word/2018/wordml" xmlns:w16du="http://schemas.microsoft.com/office/word/2023/wordml/word16du" xmlns:w16sdtdh="http://schemas.microsoft.com/office/word/2020/wordml/sdtdatahash" xmlns:w16sdtfl="http://schemas.microsoft.com/office/word/2024/wordml/sdtformatlock" xmlns:w16se="http://schemas.microsoft.com/office/word/2015/wordml/symex" mc:Ignorable="w14 w15 w16se w16cid w16 w16cex w16sdtdh w16sdtfl w16du">
   <w:docDefaults>
     <w:rPrDefault>
       <w:rPr>
@@ -2680,7 +3638,7 @@
     <w:lsdException w:name="Closing" w:semiHidden="1" w:unhideWhenUsed="1"/>
     <w:lsdException w:name="Signature" w:semiHidden="1" w:unhideWhenUsed="1"/>
     <w:lsdException w:name="Default Paragraph Font" w:semiHidden="1" w:uiPriority="1" w:unhideWhenUsed="1"/>
-    <w:lsdException w:name="Body Text" w:semiHidden="1" w:unhideWhenUsed="1"/>
+    <w:lsdException w:name="Body Text" w:semiHidden="1" w:uiPriority="1" w:unhideWhenUsed="1" w:qFormat="1"/>
     <w:lsdException w:name="Body Text Indent" w:semiHidden="1" w:unhideWhenUsed="1"/>
     <w:lsdException w:name="List Continue" w:semiHidden="1" w:unhideWhenUsed="1"/>
     <w:lsdException w:name="List Continue 2" w:semiHidden="1" w:unhideWhenUsed="1"/>
@@ -3098,6 +4056,39 @@
       <w:szCs w:val="20"/>
     </w:rPr>
   </w:style>
+  <w:style w:type="paragraph" w:styleId="BodyText">
+    <w:name w:val="Body Text"/>
+    <w:basedOn w:val="Normal"/>
+    <w:link w:val="BodyTextChar"/>
+    <w:uiPriority w:val="1"/>
+    <w:qFormat/>
+    <w:rsid w:val="00703EC4"/>
+    <w:pPr>
+      <w:widowControl w:val="0"/>
+      <w:autoSpaceDE w:val="0"/>
+      <w:autoSpaceDN w:val="0"/>
+      <w:spacing w:after="0" w:line="240" w:lineRule="auto"/>
+    </w:pPr>
+    <w:rPr>
+      <w:rFonts w:ascii="Times New Roman" w:eastAsia="Times New Roman" w:hAnsi="Times New Roman" w:cs="Times New Roman"/>
+      <w:sz w:val="24"/>
+      <w:szCs w:val="24"/>
+      <w:lang w:val="en-US"/>
+    </w:rPr>
+  </w:style>
+  <w:style w:type="character" w:customStyle="1" w:styleId="BodyTextChar">
+    <w:name w:val="Body Text Char"/>
+    <w:basedOn w:val="DefaultParagraphFont"/>
+    <w:link w:val="BodyText"/>
+    <w:uiPriority w:val="1"/>
+    <w:rsid w:val="00703EC4"/>
+    <w:rPr>
+      <w:rFonts w:ascii="Times New Roman" w:eastAsia="Times New Roman" w:hAnsi="Times New Roman" w:cs="Times New Roman"/>
+      <w:sz w:val="24"/>
+      <w:szCs w:val="24"/>
+      <w:lang w:val="en-US"/>
+    </w:rPr>
+  </w:style>
 </w:styles>
 </file>
 

</xml_diff>